<commit_message>
Update document : Story_Alter改进.docx
git-svn-id: http://192.168.20.11/sequoiadb/trunk@34622 6121f079-4a18-41d3-8c30-8870a322f2c2
</commit_message>
<xml_diff>
--- a/internal_doc/03.开发设计/alter/Story_Alter改进.docx
+++ b/internal_doc/03.开发设计/alter/Story_Alter改进.docx
@@ -542,19 +542,10 @@
         <w:t>一致）</w:t>
       </w:r>
     </w:p>
-    <w:p>
-      <w:pPr>
-        <w:rPr>
-          <w:rFonts w:hint="eastAsia"/>
-        </w:rPr>
-      </w:pPr>
-    </w:p>
+    <w:p/>
     <w:p>
       <w:pPr>
         <w:pStyle w:val="Heading3"/>
-        <w:rPr>
-          <w:rFonts w:hint="eastAsia"/>
-        </w:rPr>
       </w:pPr>
       <w:r>
         <w:rPr>
@@ -563,13 +554,7 @@
         <w:t>支持的接口</w:t>
       </w:r>
     </w:p>
-    <w:p>
-      <w:pPr>
-        <w:rPr>
-          <w:rFonts w:hint="eastAsia"/>
-        </w:rPr>
-      </w:pPr>
-    </w:p>
+    <w:p/>
     <w:p>
       <w:pPr>
         <w:pStyle w:val="ListParagraph"/>
@@ -610,9 +595,6 @@
           <w:numId w:val="12"/>
         </w:numPr>
         <w:ind w:firstLineChars="0"/>
-        <w:rPr>
-          <w:rFonts w:hint="eastAsia"/>
-        </w:rPr>
       </w:pPr>
       <w:r>
         <w:rPr>
@@ -621,19 +603,10 @@
         <w:t>SdbDomain.alter()</w:t>
       </w:r>
     </w:p>
-    <w:p>
-      <w:pPr>
-        <w:rPr>
-          <w:rFonts w:hint="eastAsia"/>
-        </w:rPr>
-      </w:pPr>
-    </w:p>
+    <w:p/>
     <w:p>
       <w:pPr>
         <w:pStyle w:val="Heading3"/>
-        <w:rPr>
-          <w:rFonts w:hint="eastAsia"/>
-        </w:rPr>
       </w:pPr>
       <w:r>
         <w:rPr>
@@ -650,9 +623,6 @@
           <w:numId w:val="13"/>
         </w:numPr>
         <w:ind w:firstLineChars="0"/>
-        <w:rPr>
-          <w:rFonts w:hint="eastAsia"/>
-        </w:rPr>
       </w:pPr>
       <w:r>
         <w:rPr>
@@ -669,9 +639,6 @@
           <w:numId w:val="13"/>
         </w:numPr>
         <w:ind w:firstLineChars="0"/>
-        <w:rPr>
-          <w:rFonts w:hint="eastAsia"/>
-        </w:rPr>
       </w:pPr>
       <w:r>
         <w:rPr>
@@ -704,9 +671,6 @@
           <w:numId w:val="13"/>
         </w:numPr>
         <w:ind w:firstLineChars="0"/>
-        <w:rPr>
-          <w:rFonts w:hint="eastAsia"/>
-        </w:rPr>
       </w:pPr>
       <w:r>
         <w:rPr>
@@ -723,9 +687,6 @@
           <w:numId w:val="13"/>
         </w:numPr>
         <w:ind w:firstLineChars="0"/>
-        <w:rPr>
-          <w:rFonts w:hint="eastAsia"/>
-        </w:rPr>
       </w:pPr>
       <w:r>
         <w:rPr>
@@ -754,9 +715,6 @@
           <w:numId w:val="13"/>
         </w:numPr>
         <w:ind w:firstLineChars="0"/>
-        <w:rPr>
-          <w:rFonts w:hint="eastAsia"/>
-        </w:rPr>
       </w:pPr>
       <w:r>
         <w:rPr>
@@ -813,9 +771,6 @@
           <w:numId w:val="13"/>
         </w:numPr>
         <w:ind w:firstLineChars="0"/>
-        <w:rPr>
-          <w:rFonts w:hint="eastAsia"/>
-        </w:rPr>
       </w:pPr>
       <w:r>
         <w:rPr>
@@ -832,9 +787,6 @@
           <w:numId w:val="13"/>
         </w:numPr>
         <w:ind w:firstLineChars="0"/>
-        <w:rPr>
-          <w:rFonts w:hint="eastAsia"/>
-        </w:rPr>
       </w:pPr>
       <w:r>
         <w:rPr>
@@ -851,9 +803,6 @@
           <w:numId w:val="13"/>
         </w:numPr>
         <w:ind w:firstLineChars="0"/>
-        <w:rPr>
-          <w:rFonts w:hint="eastAsia"/>
-        </w:rPr>
       </w:pPr>
       <w:r>
         <w:rPr>
@@ -944,28 +893,21 @@
     <w:p>
       <w:pPr>
         <w:rPr>
-          <w:rFonts w:hint="eastAsia"/>
           <w:color w:val="00B0F0"/>
         </w:rPr>
       </w:pPr>
     </w:p>
     <w:p>
-      <w:pPr>
-        <w:rPr>
-          <w:rFonts w:hint="eastAsia"/>
-        </w:rPr>
-      </w:pPr>
       <w:r>
         <w:rPr>
-          <w:rFonts w:hint="eastAsia"/>
           <w:noProof/>
         </w:rPr>
         <w:lastRenderedPageBreak/>
         <w:drawing>
           <wp:inline distT="0" distB="0" distL="0" distR="0">
-            <wp:extent cx="5274310" cy="4207190"/>
+            <wp:extent cx="5274310" cy="4135447"/>
             <wp:effectExtent l="19050" t="0" r="2540" b="0"/>
-            <wp:docPr id="6" name="Picture 6"/>
+            <wp:docPr id="5" name="Picture 2"/>
             <wp:cNvGraphicFramePr>
               <a:graphicFrameLocks xmlns:a="http://schemas.openxmlformats.org/drawingml/2006/main" noChangeAspect="1"/>
             </wp:cNvGraphicFramePr>
@@ -973,7 +915,7 @@
               <a:graphicData uri="http://schemas.openxmlformats.org/drawingml/2006/picture">
                 <pic:pic xmlns:pic="http://schemas.openxmlformats.org/drawingml/2006/picture">
                   <pic:nvPicPr>
-                    <pic:cNvPr id="0" name="Picture 6"/>
+                    <pic:cNvPr id="0" name="Picture 2"/>
                     <pic:cNvPicPr>
                       <a:picLocks noChangeAspect="1" noChangeArrowheads="1"/>
                     </pic:cNvPicPr>
@@ -988,7 +930,7 @@
                   <pic:spPr bwMode="auto">
                     <a:xfrm>
                       <a:off x="0" y="0"/>
-                      <a:ext cx="5274310" cy="4207190"/>
+                      <a:ext cx="5274310" cy="4135447"/>
                     </a:xfrm>
                     <a:prstGeom prst="rect">
                       <a:avLst/>
@@ -1008,13 +950,7 @@
         </w:drawing>
       </w:r>
     </w:p>
-    <w:p>
-      <w:pPr>
-        <w:rPr>
-          <w:rFonts w:hint="eastAsia"/>
-        </w:rPr>
-      </w:pPr>
-    </w:p>
+    <w:p/>
     <w:p>
       <w:pPr>
         <w:pStyle w:val="ListParagraph"/>
@@ -1023,9 +959,6 @@
           <w:numId w:val="14"/>
         </w:numPr>
         <w:ind w:firstLineChars="0"/>
-        <w:rPr>
-          <w:rFonts w:hint="eastAsia"/>
-        </w:rPr>
       </w:pPr>
       <w:r>
         <w:rPr>
@@ -1042,9 +975,6 @@
           <w:numId w:val="14"/>
         </w:numPr>
         <w:ind w:firstLineChars="0"/>
-        <w:rPr>
-          <w:rFonts w:hint="eastAsia"/>
-        </w:rPr>
       </w:pPr>
       <w:r>
         <w:rPr>
@@ -1085,9 +1015,6 @@
           <w:numId w:val="14"/>
         </w:numPr>
         <w:ind w:firstLineChars="0"/>
-        <w:rPr>
-          <w:rFonts w:hint="eastAsia"/>
-        </w:rPr>
       </w:pPr>
       <w:r>
         <w:rPr>
@@ -1104,9 +1031,6 @@
           <w:numId w:val="14"/>
         </w:numPr>
         <w:ind w:firstLineChars="0"/>
-        <w:rPr>
-          <w:rFonts w:hint="eastAsia"/>
-        </w:rPr>
       </w:pPr>
       <w:r>
         <w:rPr>
@@ -1123,9 +1047,6 @@
           <w:numId w:val="14"/>
         </w:numPr>
         <w:ind w:firstLineChars="0"/>
-        <w:rPr>
-          <w:rFonts w:hint="eastAsia"/>
-        </w:rPr>
       </w:pPr>
       <w:r>
         <w:rPr>
@@ -1142,6 +1063,9 @@
           <w:numId w:val="14"/>
         </w:numPr>
         <w:ind w:firstLineChars="0"/>
+        <w:rPr>
+          <w:rFonts w:hint="eastAsia"/>
+        </w:rPr>
       </w:pPr>
       <w:r>
         <w:rPr>
@@ -1164,11 +1088,107 @@
     </w:p>
     <w:p>
       <w:pPr>
+        <w:pStyle w:val="ListParagraph"/>
+        <w:numPr>
+          <w:ilvl w:val="0"/>
+          <w:numId w:val="14"/>
+        </w:numPr>
+        <w:ind w:firstLineChars="0"/>
         <w:rPr>
           <w:rFonts w:hint="eastAsia"/>
         </w:rPr>
       </w:pPr>
+      <w:r>
+        <w:rPr>
+          <w:rFonts w:hint="eastAsia"/>
+        </w:rPr>
+        <w:t>utilCatalogObject</w:t>
+      </w:r>
     </w:p>
+    <w:p>
+      <w:pPr>
+        <w:pStyle w:val="ListParagraph"/>
+        <w:numPr>
+          <w:ilvl w:val="1"/>
+          <w:numId w:val="14"/>
+        </w:numPr>
+        <w:ind w:firstLineChars="0"/>
+        <w:rPr>
+          <w:rFonts w:hint="eastAsia"/>
+        </w:rPr>
+      </w:pPr>
+      <w:r>
+        <w:rPr>
+          <w:rFonts w:hint="eastAsia"/>
+        </w:rPr>
+        <w:t>元数据的实例，包括域、集合空间、集合等</w:t>
+      </w:r>
+    </w:p>
+    <w:p>
+      <w:pPr>
+        <w:pStyle w:val="ListParagraph"/>
+        <w:numPr>
+          <w:ilvl w:val="1"/>
+          <w:numId w:val="14"/>
+        </w:numPr>
+        <w:ind w:firstLineChars="0"/>
+      </w:pPr>
+      <w:r>
+        <w:rPr>
+          <w:rFonts w:hint="eastAsia"/>
+        </w:rPr>
+        <w:t>可以直接</w:t>
+      </w:r>
+      <w:r>
+        <w:rPr>
+          <w:rFonts w:hint="eastAsia"/>
+        </w:rPr>
+        <w:t>serialize</w:t>
+      </w:r>
+      <w:r>
+        <w:rPr>
+          <w:rFonts w:hint="eastAsia"/>
+        </w:rPr>
+        <w:t>到</w:t>
+      </w:r>
+      <w:r>
+        <w:rPr>
+          <w:rFonts w:hint="eastAsia"/>
+        </w:rPr>
+        <w:t>SYS</w:t>
+      </w:r>
+      <w:r>
+        <w:rPr>
+          <w:rFonts w:hint="eastAsia"/>
+        </w:rPr>
+        <w:t>集合中，或者从</w:t>
+      </w:r>
+      <w:r>
+        <w:rPr>
+          <w:rFonts w:hint="eastAsia"/>
+        </w:rPr>
+        <w:t>SYS</w:t>
+      </w:r>
+      <w:r>
+        <w:rPr>
+          <w:rFonts w:hint="eastAsia"/>
+        </w:rPr>
+        <w:t>集合中</w:t>
+      </w:r>
+      <w:r>
+        <w:rPr>
+          <w:rFonts w:hint="eastAsia"/>
+        </w:rPr>
+        <w:t>deserialize</w:t>
+      </w:r>
+      <w:r>
+        <w:rPr>
+          <w:rFonts w:hint="eastAsia"/>
+        </w:rPr>
+        <w:t>到实例中</w:t>
+      </w:r>
+    </w:p>
+    <w:p/>
     <w:p/>
     <w:p>
       <w:pPr>
@@ -1185,9 +1205,6 @@
     <w:p>
       <w:pPr>
         <w:pStyle w:val="Heading4"/>
-        <w:rPr>
-          <w:rFonts w:hint="eastAsia"/>
-        </w:rPr>
       </w:pPr>
       <w:r>
         <w:rPr>
@@ -1199,9 +1216,6 @@
     <w:p>
       <w:pPr>
         <w:pStyle w:val="Heading5"/>
-        <w:rPr>
-          <w:rFonts w:hint="eastAsia"/>
-        </w:rPr>
       </w:pPr>
       <w:r>
         <w:rPr>
@@ -1211,11 +1225,6 @@
       </w:r>
     </w:p>
     <w:p>
-      <w:pPr>
-        <w:rPr>
-          <w:rFonts w:hint="eastAsia"/>
-        </w:rPr>
-      </w:pPr>
       <w:r>
         <w:rPr>
           <w:rFonts w:hint="eastAsia"/>
@@ -1268,19 +1277,10 @@
         </w:drawing>
       </w:r>
     </w:p>
-    <w:p>
-      <w:pPr>
-        <w:rPr>
-          <w:rFonts w:hint="eastAsia"/>
-        </w:rPr>
-      </w:pPr>
-    </w:p>
+    <w:p/>
     <w:p>
       <w:pPr>
         <w:pStyle w:val="Heading5"/>
-        <w:rPr>
-          <w:rFonts w:hint="eastAsia"/>
-        </w:rPr>
       </w:pPr>
       <w:r>
         <w:rPr>
@@ -1290,11 +1290,6 @@
       </w:r>
     </w:p>
     <w:p>
-      <w:pPr>
-        <w:rPr>
-          <w:rFonts w:hint="eastAsia"/>
-        </w:rPr>
-      </w:pPr>
       <w:r>
         <w:rPr>
           <w:rFonts w:hint="eastAsia"/>
@@ -1326,13 +1321,7 @@
         <w:t>元数据的修改</w:t>
       </w:r>
     </w:p>
-    <w:p>
-      <w:pPr>
-        <w:rPr>
-          <w:rFonts w:hint="eastAsia"/>
-        </w:rPr>
-      </w:pPr>
-    </w:p>
+    <w:p/>
     <w:tbl>
       <w:tblPr>
         <w:tblStyle w:val="TableGrid"/>
@@ -1374,9 +1363,6 @@
           <w:p>
             <w:pPr>
               <w:ind w:left="0"/>
-              <w:rPr>
-                <w:rFonts w:hint="eastAsia"/>
-              </w:rPr>
             </w:pPr>
             <w:r>
               <w:rPr>
@@ -1394,20 +1380,8 @@
         </w:tc>
       </w:tr>
     </w:tbl>
-    <w:p>
-      <w:pPr>
-        <w:rPr>
-          <w:rFonts w:hint="eastAsia"/>
-        </w:rPr>
-      </w:pPr>
-    </w:p>
-    <w:p>
-      <w:pPr>
-        <w:rPr>
-          <w:rFonts w:hint="eastAsia"/>
-        </w:rPr>
-      </w:pPr>
-    </w:p>
+    <w:p/>
+    <w:p/>
     <w:p>
       <w:pPr>
         <w:pStyle w:val="Heading5"/>
@@ -1423,9 +1397,6 @@
     <w:p>
       <w:pPr>
         <w:pStyle w:val="Heading6"/>
-        <w:rPr>
-          <w:rFonts w:hint="eastAsia"/>
-        </w:rPr>
       </w:pPr>
       <w:r>
         <w:rPr>
@@ -2749,9 +2720,6 @@
     <w:p>
       <w:pPr>
         <w:pStyle w:val="Heading6"/>
-        <w:rPr>
-          <w:rFonts w:hint="eastAsia"/>
-        </w:rPr>
       </w:pPr>
       <w:r>
         <w:rPr>
@@ -6755,19 +6723,10 @@
         </w:tc>
       </w:tr>
     </w:tbl>
-    <w:p>
-      <w:pPr>
-        <w:rPr>
-          <w:rFonts w:hint="eastAsia"/>
-        </w:rPr>
-      </w:pPr>
-    </w:p>
+    <w:p/>
     <w:p>
       <w:pPr>
         <w:pStyle w:val="Heading6"/>
-        <w:rPr>
-          <w:rFonts w:hint="eastAsia"/>
-        </w:rPr>
       </w:pPr>
       <w:r>
         <w:rPr>
@@ -8307,19 +8266,10 @@
         </w:tc>
       </w:tr>
     </w:tbl>
-    <w:p>
-      <w:pPr>
-        <w:rPr>
-          <w:rFonts w:hint="eastAsia"/>
-        </w:rPr>
-      </w:pPr>
-    </w:p>
+    <w:p/>
     <w:p>
       <w:pPr>
         <w:pStyle w:val="Heading6"/>
-        <w:rPr>
-          <w:rFonts w:hint="eastAsia"/>
-        </w:rPr>
       </w:pPr>
       <w:r>
         <w:rPr>
@@ -8399,7 +8349,6 @@
             <w:pPr>
               <w:ind w:left="0"/>
               <w:rPr>
-                <w:rFonts w:hint="eastAsia"/>
                 <w:sz w:val="15"/>
                 <w:szCs w:val="15"/>
               </w:rPr>
@@ -8748,7 +8697,6 @@
             <w:pPr>
               <w:ind w:left="0"/>
               <w:rPr>
-                <w:rFonts w:hint="eastAsia"/>
                 <w:sz w:val="15"/>
                 <w:szCs w:val="15"/>
               </w:rPr>
@@ -8796,7 +8744,6 @@
             <w:pPr>
               <w:ind w:left="0"/>
               <w:rPr>
-                <w:rFonts w:hint="eastAsia"/>
                 <w:sz w:val="15"/>
                 <w:szCs w:val="15"/>
               </w:rPr>
@@ -8898,7 +8845,6 @@
             <w:pPr>
               <w:ind w:left="0"/>
               <w:rPr>
-                <w:rFonts w:hint="eastAsia"/>
                 <w:sz w:val="15"/>
                 <w:szCs w:val="15"/>
               </w:rPr>
@@ -9084,7 +9030,6 @@
             <w:pPr>
               <w:ind w:left="0"/>
               <w:rPr>
-                <w:rFonts w:hint="eastAsia"/>
                 <w:sz w:val="15"/>
                 <w:szCs w:val="15"/>
               </w:rPr>
@@ -9132,7 +9077,6 @@
             <w:pPr>
               <w:ind w:left="0"/>
               <w:rPr>
-                <w:rFonts w:hint="eastAsia"/>
                 <w:sz w:val="15"/>
                 <w:szCs w:val="15"/>
               </w:rPr>
@@ -9235,7 +9179,6 @@
             <w:pPr>
               <w:ind w:left="0"/>
               <w:rPr>
-                <w:rFonts w:hint="eastAsia"/>
                 <w:sz w:val="15"/>
                 <w:szCs w:val="15"/>
               </w:rPr>
@@ -9424,7 +9367,6 @@
             <w:pPr>
               <w:ind w:left="0"/>
               <w:rPr>
-                <w:rFonts w:hint="eastAsia"/>
                 <w:sz w:val="15"/>
                 <w:szCs w:val="15"/>
               </w:rPr>
@@ -9548,7 +9490,6 @@
             <w:pPr>
               <w:ind w:left="0"/>
               <w:rPr>
-                <w:rFonts w:hint="eastAsia"/>
                 <w:sz w:val="15"/>
                 <w:szCs w:val="15"/>
               </w:rPr>
@@ -10796,7 +10737,6 @@
             <w:pPr>
               <w:ind w:left="0"/>
               <w:rPr>
-                <w:rFonts w:hint="eastAsia"/>
                 <w:sz w:val="15"/>
                 <w:szCs w:val="15"/>
               </w:rPr>
@@ -11826,7 +11766,6 @@
             <w:pPr>
               <w:ind w:left="0"/>
               <w:rPr>
-                <w:rFonts w:hint="eastAsia"/>
                 <w:sz w:val="15"/>
                 <w:szCs w:val="15"/>
               </w:rPr>
@@ -11868,7 +11807,6 @@
             <w:pPr>
               <w:ind w:left="0"/>
               <w:rPr>
-                <w:rFonts w:hint="eastAsia"/>
                 <w:sz w:val="15"/>
                 <w:szCs w:val="15"/>
               </w:rPr>
@@ -11902,13 +11840,17 @@
             <w:pPr>
               <w:ind w:left="0"/>
               <w:rPr>
-                <w:sz w:val="15"/>
-                <w:szCs w:val="15"/>
-              </w:rPr>
-            </w:pPr>
-            <w:r>
-              <w:rPr>
-                <w:rFonts w:hint="eastAsia"/>
+                <w:b/>
+                <w:color w:val="FF0000"/>
+                <w:sz w:val="15"/>
+                <w:szCs w:val="15"/>
+              </w:rPr>
+            </w:pPr>
+            <w:r>
+              <w:rPr>
+                <w:rFonts w:hint="eastAsia"/>
+                <w:b/>
+                <w:color w:val="FF0000"/>
                 <w:sz w:val="15"/>
                 <w:szCs w:val="15"/>
               </w:rPr>
@@ -11917,6 +11859,8 @@
             <w:r>
               <w:rPr>
                 <w:rFonts w:hint="eastAsia"/>
+                <w:b/>
+                <w:color w:val="FF0000"/>
                 <w:sz w:val="15"/>
                 <w:szCs w:val="15"/>
               </w:rPr>
@@ -12391,26 +12335,11 @@
       </w:tr>
     </w:tbl>
     <w:p/>
-    <w:p>
-      <w:pPr>
-        <w:rPr>
-          <w:rFonts w:hint="eastAsia"/>
-        </w:rPr>
-      </w:pPr>
-    </w:p>
-    <w:p>
-      <w:pPr>
-        <w:rPr>
-          <w:rFonts w:hint="eastAsia"/>
-        </w:rPr>
-      </w:pPr>
-    </w:p>
+    <w:p/>
+    <w:p/>
     <w:p>
       <w:pPr>
         <w:pStyle w:val="Heading4"/>
-        <w:rPr>
-          <w:rFonts w:hint="eastAsia"/>
-        </w:rPr>
       </w:pPr>
       <w:r>
         <w:rPr>
@@ -12419,19 +12348,10 @@
         <w:t>Alter Collection Space</w:t>
       </w:r>
     </w:p>
-    <w:p>
-      <w:pPr>
-        <w:rPr>
-          <w:rFonts w:hint="eastAsia"/>
-        </w:rPr>
-      </w:pPr>
-    </w:p>
+    <w:p/>
     <w:p>
       <w:pPr>
         <w:pStyle w:val="Heading5"/>
-        <w:rPr>
-          <w:rFonts w:hint="eastAsia"/>
-        </w:rPr>
       </w:pPr>
       <w:r>
         <w:rPr>
@@ -12441,19 +12361,8 @@
         <w:t>流程</w:t>
       </w:r>
     </w:p>
+    <w:p/>
     <w:p>
-      <w:pPr>
-        <w:rPr>
-          <w:rFonts w:hint="eastAsia"/>
-        </w:rPr>
-      </w:pPr>
-    </w:p>
-    <w:p>
-      <w:pPr>
-        <w:rPr>
-          <w:rFonts w:hint="eastAsia"/>
-        </w:rPr>
-      </w:pPr>
       <w:r>
         <w:rPr>
           <w:rFonts w:hint="eastAsia"/>
@@ -12506,19 +12415,10 @@
         </w:drawing>
       </w:r>
     </w:p>
-    <w:p>
-      <w:pPr>
-        <w:rPr>
-          <w:rFonts w:hint="eastAsia"/>
-        </w:rPr>
-      </w:pPr>
-    </w:p>
+    <w:p/>
     <w:p>
       <w:pPr>
         <w:pStyle w:val="Heading5"/>
-        <w:rPr>
-          <w:rFonts w:hint="eastAsia"/>
-        </w:rPr>
       </w:pPr>
       <w:r>
         <w:rPr>
@@ -12536,9 +12436,6 @@
     <w:p>
       <w:pPr>
         <w:pStyle w:val="Heading6"/>
-        <w:rPr>
-          <w:rFonts w:hint="eastAsia"/>
-        </w:rPr>
       </w:pPr>
       <w:r>
         <w:rPr>
@@ -12548,11 +12445,6 @@
       </w:r>
     </w:p>
     <w:p>
-      <w:pPr>
-        <w:rPr>
-          <w:rFonts w:hint="eastAsia"/>
-        </w:rPr>
-      </w:pPr>
       <w:r>
         <w:rPr>
           <w:rFonts w:hint="eastAsia"/>
@@ -12567,11 +12459,6 @@
       </w:r>
     </w:p>
     <w:p>
-      <w:pPr>
-        <w:rPr>
-          <w:rFonts w:hint="eastAsia"/>
-        </w:rPr>
-      </w:pPr>
       <w:r>
         <w:rPr>
           <w:rFonts w:hint="eastAsia"/>
@@ -12603,9 +12490,6 @@
           <w:p>
             <w:pPr>
               <w:ind w:left="0"/>
-              <w:rPr>
-                <w:rFonts w:hint="eastAsia"/>
-              </w:rPr>
             </w:pPr>
             <w:r>
               <w:rPr>
@@ -12617,9 +12501,6 @@
           <w:p>
             <w:pPr>
               <w:ind w:left="0"/>
-              <w:rPr>
-                <w:rFonts w:hint="eastAsia"/>
-              </w:rPr>
             </w:pPr>
             <w:r>
               <w:rPr>
@@ -12631,19 +12512,10 @@
         </w:tc>
       </w:tr>
     </w:tbl>
-    <w:p>
-      <w:pPr>
-        <w:rPr>
-          <w:rFonts w:hint="eastAsia"/>
-        </w:rPr>
-      </w:pPr>
-    </w:p>
+    <w:p/>
     <w:p>
       <w:pPr>
         <w:pStyle w:val="Heading6"/>
-        <w:rPr>
-          <w:rFonts w:hint="eastAsia"/>
-        </w:rPr>
       </w:pPr>
       <w:r>
         <w:rPr>
@@ -12652,13 +12524,7 @@
         <w:t>MSG_CAT_ALTER_COLLECTION_SPACE_REQ</w:t>
       </w:r>
     </w:p>
-    <w:p>
-      <w:pPr>
-        <w:rPr>
-          <w:rFonts w:hint="eastAsia"/>
-        </w:rPr>
-      </w:pPr>
-    </w:p>
+    <w:p/>
     <w:tbl>
       <w:tblPr>
         <w:tblStyle w:val="TableGrid"/>
@@ -12677,9 +12543,6 @@
           <w:p>
             <w:pPr>
               <w:ind w:left="0"/>
-              <w:rPr>
-                <w:rFonts w:hint="eastAsia"/>
-              </w:rPr>
             </w:pPr>
             <w:r>
               <w:rPr>
@@ -12691,9 +12554,6 @@
           <w:p>
             <w:pPr>
               <w:ind w:left="0"/>
-              <w:rPr>
-                <w:rFonts w:hint="eastAsia"/>
-              </w:rPr>
             </w:pPr>
             <w:r>
               <w:rPr>
@@ -12705,19 +12565,10 @@
         </w:tc>
       </w:tr>
     </w:tbl>
-    <w:p>
-      <w:pPr>
-        <w:rPr>
-          <w:rFonts w:hint="eastAsia"/>
-        </w:rPr>
-      </w:pPr>
-    </w:p>
+    <w:p/>
     <w:p>
       <w:pPr>
         <w:pStyle w:val="Heading6"/>
-        <w:rPr>
-          <w:rFonts w:hint="eastAsia"/>
-        </w:rPr>
       </w:pPr>
       <w:r>
         <w:rPr>
@@ -12727,11 +12578,6 @@
       </w:r>
     </w:p>
     <w:p>
-      <w:pPr>
-        <w:rPr>
-          <w:rFonts w:hint="eastAsia"/>
-        </w:rPr>
-      </w:pPr>
       <w:r>
         <w:rPr>
           <w:rFonts w:hint="eastAsia"/>
@@ -12739,19 +12585,8 @@
         <w:t>错误码返回</w:t>
       </w:r>
     </w:p>
+    <w:p/>
     <w:p>
-      <w:pPr>
-        <w:rPr>
-          <w:rFonts w:hint="eastAsia"/>
-        </w:rPr>
-      </w:pPr>
-    </w:p>
-    <w:p>
-      <w:pPr>
-        <w:rPr>
-          <w:rFonts w:hint="eastAsia"/>
-        </w:rPr>
-      </w:pPr>
       <w:r>
         <w:t>SDB_DMS_CS_NOT_EMPTY</w:t>
       </w:r>
@@ -12768,19 +12603,10 @@
         <w:t>集合空间非空</w:t>
       </w:r>
     </w:p>
-    <w:p>
-      <w:pPr>
-        <w:rPr>
-          <w:rFonts w:hint="eastAsia"/>
-        </w:rPr>
-      </w:pPr>
-    </w:p>
+    <w:p/>
     <w:p>
       <w:pPr>
         <w:pStyle w:val="Heading5"/>
-        <w:rPr>
-          <w:rFonts w:hint="eastAsia"/>
-        </w:rPr>
       </w:pPr>
       <w:r>
         <w:rPr>
@@ -12793,9 +12619,6 @@
     <w:p>
       <w:pPr>
         <w:pStyle w:val="Heading6"/>
-        <w:rPr>
-          <w:rFonts w:hint="eastAsia"/>
-        </w:rPr>
       </w:pPr>
       <w:r>
         <w:rPr>
@@ -12947,15 +12770,7 @@
                 <w:sz w:val="15"/>
                 <w:szCs w:val="15"/>
               </w:rPr>
-              <w:t>集合</w:t>
-            </w:r>
-            <w:r>
-              <w:rPr>
-                <w:rFonts w:hint="eastAsia"/>
-                <w:sz w:val="15"/>
-                <w:szCs w:val="15"/>
-              </w:rPr>
-              <w:t>空间名称</w:t>
+              <w:t>集合空间名称</w:t>
             </w:r>
           </w:p>
         </w:tc>
@@ -13157,19 +12972,10 @@
         </w:tc>
       </w:tr>
     </w:tbl>
-    <w:p>
-      <w:pPr>
-        <w:rPr>
-          <w:rFonts w:hint="eastAsia"/>
-        </w:rPr>
-      </w:pPr>
-    </w:p>
+    <w:p/>
     <w:p>
       <w:pPr>
         <w:pStyle w:val="Heading6"/>
-        <w:rPr>
-          <w:rFonts w:hint="eastAsia"/>
-        </w:rPr>
       </w:pPr>
       <w:r>
         <w:rPr>
@@ -13178,13 +12984,7 @@
         <w:t>选项创建</w:t>
       </w:r>
     </w:p>
-    <w:p>
-      <w:pPr>
-        <w:rPr>
-          <w:rFonts w:hint="eastAsia"/>
-        </w:rPr>
-      </w:pPr>
-    </w:p>
+    <w:p/>
     <w:tbl>
       <w:tblPr>
         <w:tblStyle w:val="TableGrid"/>
@@ -14064,19 +13864,10 @@
         </w:tc>
       </w:tr>
     </w:tbl>
-    <w:p>
-      <w:pPr>
-        <w:rPr>
-          <w:rFonts w:hint="eastAsia"/>
-        </w:rPr>
-      </w:pPr>
-    </w:p>
+    <w:p/>
     <w:p>
       <w:pPr>
         <w:pStyle w:val="Heading6"/>
-        <w:rPr>
-          <w:rFonts w:hint="eastAsia"/>
-        </w:rPr>
       </w:pPr>
       <w:r>
         <w:rPr>
@@ -14085,13 +13876,7 @@
         <w:t>选项存储</w:t>
       </w:r>
     </w:p>
-    <w:p>
-      <w:pPr>
-        <w:rPr>
-          <w:rFonts w:hint="eastAsia"/>
-        </w:rPr>
-      </w:pPr>
-    </w:p>
+    <w:p/>
     <w:tbl>
       <w:tblPr>
         <w:tblStyle w:val="TableGrid"/>
@@ -14453,19 +14238,10 @@
         </w:tc>
       </w:tr>
     </w:tbl>
-    <w:p>
-      <w:pPr>
-        <w:rPr>
-          <w:rFonts w:hint="eastAsia"/>
-        </w:rPr>
-      </w:pPr>
-    </w:p>
+    <w:p/>
     <w:p>
       <w:pPr>
         <w:pStyle w:val="Heading6"/>
-        <w:rPr>
-          <w:rFonts w:hint="eastAsia"/>
-        </w:rPr>
       </w:pPr>
       <w:r>
         <w:rPr>
@@ -14474,13 +14250,7 @@
         <w:t>选项修改</w:t>
       </w:r>
     </w:p>
-    <w:p>
-      <w:pPr>
-        <w:rPr>
-          <w:rFonts w:hint="eastAsia"/>
-        </w:rPr>
-      </w:pPr>
-    </w:p>
+    <w:p/>
     <w:tbl>
       <w:tblPr>
         <w:tblStyle w:val="TableGrid"/>
@@ -14551,7 +14321,6 @@
             <w:pPr>
               <w:ind w:left="0"/>
               <w:rPr>
-                <w:rFonts w:hint="eastAsia"/>
                 <w:sz w:val="15"/>
                 <w:szCs w:val="15"/>
               </w:rPr>
@@ -14900,7 +14669,6 @@
             <w:pPr>
               <w:ind w:left="0"/>
               <w:rPr>
-                <w:rFonts w:hint="eastAsia"/>
                 <w:sz w:val="15"/>
                 <w:szCs w:val="15"/>
               </w:rPr>
@@ -14963,15 +14731,7 @@
                 <w:sz w:val="15"/>
                 <w:szCs w:val="15"/>
               </w:rPr>
-              <w:t>SYS</w:t>
-            </w:r>
-            <w:r>
-              <w:rPr>
-                <w:rFonts w:hint="eastAsia"/>
-                <w:sz w:val="15"/>
-                <w:szCs w:val="15"/>
-              </w:rPr>
-              <w:t>COLLECTIONSPACES</w:t>
+              <w:t>SYSCOLLECTIONSPACES</w:t>
             </w:r>
           </w:p>
         </w:tc>
@@ -15071,7 +14831,6 @@
             <w:pPr>
               <w:ind w:left="0"/>
               <w:rPr>
-                <w:rFonts w:hint="eastAsia"/>
                 <w:sz w:val="15"/>
                 <w:szCs w:val="15"/>
               </w:rPr>
@@ -15289,15 +15048,7 @@
                 <w:sz w:val="15"/>
                 <w:szCs w:val="15"/>
               </w:rPr>
-              <w:t>SYSC</w:t>
-            </w:r>
-            <w:r>
-              <w:rPr>
-                <w:rFonts w:hint="eastAsia"/>
-                <w:sz w:val="15"/>
-                <w:szCs w:val="15"/>
-              </w:rPr>
-              <w:t>OLLECTIONSPACES</w:t>
+              <w:t>SYSCOLLECTIONSPACES</w:t>
             </w:r>
           </w:p>
         </w:tc>
@@ -15345,33 +15096,12 @@
         </w:tc>
       </w:tr>
     </w:tbl>
-    <w:p>
-      <w:pPr>
-        <w:rPr>
-          <w:rFonts w:hint="eastAsia"/>
-        </w:rPr>
-      </w:pPr>
-    </w:p>
-    <w:p>
-      <w:pPr>
-        <w:rPr>
-          <w:rFonts w:hint="eastAsia"/>
-        </w:rPr>
-      </w:pPr>
-    </w:p>
-    <w:p>
-      <w:pPr>
-        <w:rPr>
-          <w:rFonts w:hint="eastAsia"/>
-        </w:rPr>
-      </w:pPr>
-    </w:p>
+    <w:p/>
+    <w:p/>
+    <w:p/>
     <w:p>
       <w:pPr>
         <w:pStyle w:val="Heading4"/>
-        <w:rPr>
-          <w:rFonts w:hint="eastAsia"/>
-        </w:rPr>
       </w:pPr>
       <w:r>
         <w:rPr>
@@ -15380,19 +15110,10 @@
         <w:t>Alter Domain</w:t>
       </w:r>
     </w:p>
-    <w:p>
-      <w:pPr>
-        <w:rPr>
-          <w:rFonts w:hint="eastAsia"/>
-        </w:rPr>
-      </w:pPr>
-    </w:p>
+    <w:p/>
     <w:p>
       <w:pPr>
         <w:pStyle w:val="Heading5"/>
-        <w:rPr>
-          <w:rFonts w:hint="eastAsia"/>
-        </w:rPr>
       </w:pPr>
       <w:r>
         <w:rPr>
@@ -15401,19 +15122,8 @@
         <w:t>流程</w:t>
       </w:r>
     </w:p>
+    <w:p/>
     <w:p>
-      <w:pPr>
-        <w:rPr>
-          <w:rFonts w:hint="eastAsia"/>
-        </w:rPr>
-      </w:pPr>
-    </w:p>
-    <w:p>
-      <w:pPr>
-        <w:rPr>
-          <w:rFonts w:hint="eastAsia"/>
-        </w:rPr>
-      </w:pPr>
       <w:r>
         <w:rPr>
           <w:rFonts w:hint="eastAsia"/>
@@ -15466,26 +15176,11 @@
         </w:drawing>
       </w:r>
     </w:p>
-    <w:p>
-      <w:pPr>
-        <w:rPr>
-          <w:rFonts w:hint="eastAsia"/>
-        </w:rPr>
-      </w:pPr>
-    </w:p>
-    <w:p>
-      <w:pPr>
-        <w:rPr>
-          <w:rFonts w:hint="eastAsia"/>
-        </w:rPr>
-      </w:pPr>
-    </w:p>
+    <w:p/>
+    <w:p/>
     <w:p>
       <w:pPr>
         <w:pStyle w:val="Heading5"/>
-        <w:rPr>
-          <w:rFonts w:hint="eastAsia"/>
-        </w:rPr>
       </w:pPr>
       <w:r>
         <w:rPr>
@@ -15494,19 +15189,10 @@
         <w:t>选项</w:t>
       </w:r>
     </w:p>
-    <w:p>
-      <w:pPr>
-        <w:rPr>
-          <w:rFonts w:hint="eastAsia"/>
-        </w:rPr>
-      </w:pPr>
-    </w:p>
+    <w:p/>
     <w:p>
       <w:pPr>
         <w:pStyle w:val="Heading6"/>
-        <w:rPr>
-          <w:rFonts w:hint="eastAsia"/>
-        </w:rPr>
       </w:pPr>
       <w:r>
         <w:rPr>
@@ -15859,19 +15545,10 @@
         </w:tc>
       </w:tr>
     </w:tbl>
-    <w:p>
-      <w:pPr>
-        <w:rPr>
-          <w:rFonts w:hint="eastAsia"/>
-        </w:rPr>
-      </w:pPr>
-    </w:p>
+    <w:p/>
     <w:p>
       <w:pPr>
         <w:pStyle w:val="Heading6"/>
-        <w:rPr>
-          <w:rFonts w:hint="eastAsia"/>
-        </w:rPr>
       </w:pPr>
       <w:r>
         <w:rPr>
@@ -15881,13 +15558,7 @@
         <w:t>选项创建</w:t>
       </w:r>
     </w:p>
-    <w:p>
-      <w:pPr>
-        <w:rPr>
-          <w:rFonts w:hint="eastAsia"/>
-        </w:rPr>
-      </w:pPr>
-    </w:p>
+    <w:p/>
     <w:tbl>
       <w:tblPr>
         <w:tblStyle w:val="TableGrid"/>
@@ -16701,19 +16372,10 @@
         </w:tc>
       </w:tr>
     </w:tbl>
-    <w:p>
-      <w:pPr>
-        <w:rPr>
-          <w:rFonts w:hint="eastAsia"/>
-        </w:rPr>
-      </w:pPr>
-    </w:p>
+    <w:p/>
     <w:p>
       <w:pPr>
         <w:pStyle w:val="Heading6"/>
-        <w:rPr>
-          <w:rFonts w:hint="eastAsia"/>
-        </w:rPr>
       </w:pPr>
       <w:r>
         <w:rPr>
@@ -16722,13 +16384,7 @@
         <w:t>选项存储</w:t>
       </w:r>
     </w:p>
-    <w:p>
-      <w:pPr>
-        <w:rPr>
-          <w:rFonts w:hint="eastAsia"/>
-        </w:rPr>
-      </w:pPr>
-    </w:p>
+    <w:p/>
     <w:tbl>
       <w:tblPr>
         <w:tblStyle w:val="TableGrid"/>
@@ -17065,19 +16721,10 @@
         </w:tc>
       </w:tr>
     </w:tbl>
-    <w:p>
-      <w:pPr>
-        <w:rPr>
-          <w:rFonts w:hint="eastAsia"/>
-        </w:rPr>
-      </w:pPr>
-    </w:p>
+    <w:p/>
     <w:p>
       <w:pPr>
         <w:pStyle w:val="Heading6"/>
-        <w:rPr>
-          <w:rFonts w:hint="eastAsia"/>
-        </w:rPr>
       </w:pPr>
       <w:r>
         <w:rPr>
@@ -17086,13 +16733,7 @@
         <w:t>选项修改</w:t>
       </w:r>
     </w:p>
-    <w:p>
-      <w:pPr>
-        <w:rPr>
-          <w:rFonts w:hint="eastAsia"/>
-        </w:rPr>
-      </w:pPr>
-    </w:p>
+    <w:p/>
     <w:tbl>
       <w:tblPr>
         <w:tblStyle w:val="TableGrid"/>
@@ -17163,7 +16804,6 @@
             <w:pPr>
               <w:ind w:left="0"/>
               <w:rPr>
-                <w:rFonts w:hint="eastAsia"/>
                 <w:sz w:val="15"/>
                 <w:szCs w:val="15"/>
               </w:rPr>
@@ -17566,15 +17206,7 @@
                 <w:sz w:val="15"/>
                 <w:szCs w:val="15"/>
               </w:rPr>
-              <w:t>SYS</w:t>
-            </w:r>
-            <w:r>
-              <w:rPr>
-                <w:rFonts w:hint="eastAsia"/>
-                <w:sz w:val="15"/>
-                <w:szCs w:val="15"/>
-              </w:rPr>
-              <w:t>DOMAINS</w:t>
+              <w:t>SYSDOMAINS</w:t>
             </w:r>
           </w:p>
         </w:tc>
@@ -17929,13 +17561,7 @@
         </w:tc>
       </w:tr>
     </w:tbl>
-    <w:p>
-      <w:pPr>
-        <w:rPr>
-          <w:rFonts w:hint="eastAsia"/>
-        </w:rPr>
-      </w:pPr>
-    </w:p>
+    <w:p/>
     <w:p/>
     <w:p>
       <w:pPr>

</xml_diff>